<commit_message>
EHIS-5885 Generated Documents - Various Formatting Bugs
</commit_message>
<xml_diff>
--- a/PHOCS-Docgentemplates/PHOCS Pool Operating Permit Document Template_v1.0.docx
+++ b/PHOCS-Docgentemplates/PHOCS Pool Operating Permit Document Template_v1.0.docx
@@ -37,6 +37,16 @@
                 <w:szCs w:val="24"/>
               </w:rPr>
             </w:pPr>
+            <w:r>
+              <w:rPr>
+                <w:rFonts w:ascii="BC Sans" w:hAnsi="BC Sans"/>
+                <w:b/>
+                <w:bCs/>
+                <w:sz w:val="24"/>
+                <w:szCs w:val="24"/>
+              </w:rPr>
+              <w:t xml:space="preserve"> </w:t>
+            </w:r>
             <w:r>
               <w:rPr>
                 <w:rFonts w:ascii="BC Sans" w:hAnsi="BC Sans"/>
@@ -238,7 +248,7 @@
                 <w:szCs w:val="24"/>
                 <w:lang w:val="en-CA"/>
               </w:rPr>
-              <w:t>{{</w:t>
+              <w:t xml:space="preserve"> </w:t>
             </w:r>
             <w:r>
               <w:rPr>
@@ -249,8 +259,9 @@
                 <w:szCs w:val="24"/>
                 <w:lang w:val="en-CA"/>
               </w:rPr>
-              <w:t>#</w:t>
+              <w:t>{{#AccountCategoryL1</w:t>
             </w:r>
+            <w:proofErr w:type="gramStart"/>
             <w:r>
               <w:rPr>
                 <w:rFonts w:ascii="BC Sans" w:hAnsi="BC Sans"/>
@@ -260,7 +271,38 @@
                 <w:szCs w:val="24"/>
                 <w:lang w:val="en-CA"/>
               </w:rPr>
-              <w:t xml:space="preserve">AccountCategoryL1}} </w:t>
+              <w:t>}}</w:t>
+            </w:r>
+            <w:r>
+              <w:rPr>
+                <w:rFonts w:ascii="BC Sans" w:hAnsi="BC Sans"/>
+                <w:b/>
+                <w:bCs/>
+                <w:sz w:val="24"/>
+                <w:szCs w:val="24"/>
+              </w:rPr>
+              <w:t>Category</w:t>
+            </w:r>
+            <w:proofErr w:type="gramEnd"/>
+            <w:r>
+              <w:rPr>
+                <w:rFonts w:ascii="BC Sans" w:hAnsi="BC Sans"/>
+                <w:b/>
+                <w:bCs/>
+                <w:sz w:val="24"/>
+                <w:szCs w:val="24"/>
+              </w:rPr>
+              <w:t>:</w:t>
+            </w:r>
+            <w:r>
+              <w:rPr>
+                <w:rFonts w:ascii="BC Sans" w:hAnsi="BC Sans"/>
+                <w:b/>
+                <w:bCs/>
+                <w:sz w:val="24"/>
+                <w:szCs w:val="24"/>
+              </w:rPr>
+              <w:br/>
             </w:r>
           </w:p>
           <w:p>
@@ -273,16 +315,6 @@
                 <w:szCs w:val="24"/>
               </w:rPr>
             </w:pPr>
-            <w:r>
-              <w:rPr>
-                <w:rFonts w:ascii="BC Sans" w:hAnsi="BC Sans"/>
-                <w:b/>
-                <w:bCs/>
-                <w:sz w:val="24"/>
-                <w:szCs w:val="24"/>
-              </w:rPr>
-              <w:t>Category:</w:t>
-            </w:r>
           </w:p>
         </w:tc>
         <w:tc>
@@ -464,7 +496,7 @@
                 <w:sz w:val="24"/>
                 <w:szCs w:val="24"/>
               </w:rPr>
-              <w:t>{{</w:t>
+              <w:t xml:space="preserve"> </w:t>
             </w:r>
             <w:r>
               <w:rPr>
@@ -474,17 +506,7 @@
                 <w:sz w:val="24"/>
                 <w:szCs w:val="24"/>
               </w:rPr>
-              <w:t>#</w:t>
-            </w:r>
-            <w:r>
-              <w:rPr>
-                <w:rFonts w:ascii="BC Sans" w:hAnsi="BC Sans"/>
-                <w:b/>
-                <w:bCs/>
-                <w:sz w:val="24"/>
-                <w:szCs w:val="24"/>
-              </w:rPr>
-              <w:t>PoolOperationSchedule</w:t>
+              <w:t>{{#PoolOperationSchedule</w:t>
             </w:r>
             <w:proofErr w:type="gramStart"/>
             <w:r>
@@ -574,15 +596,7 @@
                 <w:sz w:val="24"/>
                 <w:szCs w:val="24"/>
               </w:rPr>
-              <w:t>{</w:t>
-            </w:r>
-            <w:r>
-              <w:rPr>
-                <w:rFonts w:ascii="BC Sans" w:hAnsi="BC Sans"/>
-                <w:sz w:val="24"/>
-                <w:szCs w:val="24"/>
-              </w:rPr>
-              <w:t>/</w:t>
+              <w:t>{/</w:t>
             </w:r>
             <w:proofErr w:type="spellStart"/>
             <w:r>
@@ -638,7 +652,8 @@
                 <w:szCs w:val="24"/>
                 <w:lang w:val="en-CA"/>
               </w:rPr>
-              <w:t>{{</w:t>
+              <w:lastRenderedPageBreak/>
+              <w:t xml:space="preserve"> </w:t>
             </w:r>
             <w:r>
               <w:rPr>
@@ -649,7 +664,7 @@
                 <w:szCs w:val="24"/>
                 <w:lang w:val="en-CA"/>
               </w:rPr>
-              <w:t>#</w:t>
+              <w:t>{{#</w:t>
             </w:r>
             <w:proofErr w:type="spellStart"/>
             <w:r>
@@ -663,6 +678,7 @@
               <w:t>BLOrganizationName</w:t>
             </w:r>
             <w:proofErr w:type="spellEnd"/>
+            <w:proofErr w:type="gramStart"/>
             <w:r>
               <w:rPr>
                 <w:rFonts w:ascii="BC Sans" w:hAnsi="BC Sans"/>
@@ -674,17 +690,6 @@
               </w:rPr>
               <w:t>}}</w:t>
             </w:r>
-          </w:p>
-          <w:p>
-            <w:pPr>
-              <w:rPr>
-                <w:rFonts w:ascii="BC Sans" w:hAnsi="BC Sans"/>
-                <w:b/>
-                <w:bCs/>
-                <w:sz w:val="24"/>
-                <w:szCs w:val="24"/>
-              </w:rPr>
-            </w:pPr>
             <w:r>
               <w:rPr>
                 <w:rFonts w:ascii="BC Sans" w:hAnsi="BC Sans"/>
@@ -693,8 +698,18 @@
                 <w:sz w:val="24"/>
                 <w:szCs w:val="24"/>
               </w:rPr>
-              <w:lastRenderedPageBreak/>
-              <w:t>Owner:</w:t>
+              <w:t>Owner</w:t>
+            </w:r>
+            <w:proofErr w:type="gramEnd"/>
+            <w:r>
+              <w:rPr>
+                <w:rFonts w:ascii="BC Sans" w:hAnsi="BC Sans"/>
+                <w:b/>
+                <w:bCs/>
+                <w:sz w:val="24"/>
+                <w:szCs w:val="24"/>
+              </w:rPr>
+              <w:t>:</w:t>
             </w:r>
           </w:p>
         </w:tc>
@@ -718,7 +733,6 @@
                 <w:szCs w:val="24"/>
                 <w:lang w:val="en-CA"/>
               </w:rPr>
-              <w:lastRenderedPageBreak/>
               <w:t>{{</w:t>
             </w:r>
             <w:proofErr w:type="spellStart"/>
@@ -822,6 +836,18 @@
           <w:p>
             <w:pPr>
               <w:spacing w:line="252" w:lineRule="auto"/>
+              <w:rPr>
+                <w:rFonts w:ascii="BC Sans" w:hAnsi="BC Sans"/>
+                <w:b/>
+                <w:bCs/>
+                <w:sz w:val="24"/>
+                <w:szCs w:val="24"/>
+              </w:rPr>
+            </w:pPr>
+          </w:p>
+          <w:p>
+            <w:pPr>
+              <w:spacing w:line="252" w:lineRule="auto"/>
             </w:pPr>
             <w:r>
               <w:rPr>
@@ -831,7 +857,16 @@
                 <w:sz w:val="24"/>
                 <w:szCs w:val="24"/>
               </w:rPr>
-              <w:lastRenderedPageBreak/>
+              <w:t xml:space="preserve"> </w:t>
+            </w:r>
+            <w:r>
+              <w:rPr>
+                <w:rFonts w:ascii="BC Sans" w:hAnsi="BC Sans"/>
+                <w:b/>
+                <w:bCs/>
+                <w:sz w:val="24"/>
+                <w:szCs w:val="24"/>
+              </w:rPr>
               <w:t xml:space="preserve">Conditions </w:t>
             </w:r>
             <w:proofErr w:type="gramStart"/>
@@ -877,6 +912,14 @@
                 <w:szCs w:val="24"/>
               </w:rPr>
             </w:pPr>
+            <w:r>
+              <w:rPr>
+                <w:rFonts w:ascii="BC Sans" w:hAnsi="BC Sans"/>
+                <w:sz w:val="24"/>
+                <w:szCs w:val="24"/>
+              </w:rPr>
+              <w:t xml:space="preserve"> </w:t>
+            </w:r>
             <w:r>
               <w:rPr>
                 <w:rFonts w:ascii="BC Sans" w:hAnsi="BC Sans"/>
@@ -1062,6 +1105,18 @@
                 <w:sz w:val="24"/>
                 <w:szCs w:val="24"/>
               </w:rPr>
+              <w:t xml:space="preserve"> </w:t>
+            </w:r>
+            <w:r>
+              <w:rPr>
+                <w:rFonts w:ascii="BC Sans" w:hAnsi="BC Sans"/>
+                <w:b/>
+                <w:bCs/>
+                <w:noProof/>
+                <w:color w:val="000000" w:themeColor="text1"/>
+                <w:sz w:val="24"/>
+                <w:szCs w:val="24"/>
+              </w:rPr>
               <w:t>Issuing Authority:</w:t>
             </w:r>
             <w:r>
@@ -1149,11 +1204,36 @@
                 <w:rFonts w:ascii="BC Sans" w:hAnsi="BC Sans"/>
                 <w:b/>
                 <w:bCs/>
+                <w:noProof/>
+                <w:color w:val="000000" w:themeColor="text1"/>
+                <w:sz w:val="24"/>
+                <w:szCs w:val="24"/>
+              </w:rPr>
+            </w:pPr>
+          </w:p>
+          <w:p>
+            <w:pPr>
+              <w:rPr>
+                <w:rFonts w:ascii="BC Sans" w:hAnsi="BC Sans"/>
+                <w:b/>
+                <w:bCs/>
                 <w:color w:val="A6A6A6" w:themeColor="background1" w:themeShade="A6"/>
                 <w:sz w:val="24"/>
                 <w:szCs w:val="24"/>
               </w:rPr>
             </w:pPr>
+            <w:r>
+              <w:rPr>
+                <w:rFonts w:ascii="BC Sans" w:hAnsi="BC Sans"/>
+                <w:b/>
+                <w:bCs/>
+                <w:noProof/>
+                <w:color w:val="000000" w:themeColor="text1"/>
+                <w:sz w:val="24"/>
+                <w:szCs w:val="24"/>
+              </w:rPr>
+              <w:t xml:space="preserve"> </w:t>
+            </w:r>
             <w:r>
               <w:rPr>
                 <w:rFonts w:ascii="BC Sans" w:hAnsi="BC Sans"/>
@@ -1172,6 +1252,17 @@
           <w:tcPr>
             <w:tcW w:w="5707" w:type="dxa"/>
           </w:tcPr>
+          <w:p>
+            <w:pPr>
+              <w:rPr>
+                <w:rFonts w:ascii="BC Sans" w:hAnsi="BC Sans"/>
+                <w:noProof/>
+                <w:color w:val="000000" w:themeColor="text1"/>
+                <w:sz w:val="24"/>
+                <w:szCs w:val="24"/>
+              </w:rPr>
+            </w:pPr>
+          </w:p>
           <w:p>
             <w:pPr>
               <w:rPr>
@@ -1227,13 +1318,16 @@
         <w:rPr>
           <w:rFonts w:ascii="BC Sans" w:hAnsi="BC Sans"/>
         </w:rPr>
-        <w:lastRenderedPageBreak/>
         <w:br w:type="textWrapping" w:clear="all"/>
       </w:r>
     </w:p>
     <w:sectPr>
-      <w:headerReference w:type="default" r:id="rId11"/>
-      <w:footerReference w:type="default" r:id="rId12"/>
+      <w:headerReference w:type="even" r:id="rId11"/>
+      <w:headerReference w:type="default" r:id="rId12"/>
+      <w:footerReference w:type="even" r:id="rId13"/>
+      <w:footerReference w:type="default" r:id="rId14"/>
+      <w:headerReference w:type="first" r:id="rId15"/>
+      <w:footerReference w:type="first" r:id="rId16"/>
       <w:pgSz w:w="12240" w:h="15840"/>
       <w:pgMar w:top="1440" w:right="1800" w:bottom="1440" w:left="1800" w:header="720" w:footer="720" w:gutter="0"/>
       <w:cols w:space="720"/>
@@ -1269,6 +1363,16 @@
 </file>
 
 <file path=word/footer1.xml><?xml version="1.0" encoding="utf-8"?>
+<w:ftr xmlns:wpc="http://schemas.microsoft.com/office/word/2010/wordprocessingCanvas" xmlns:cx="http://schemas.microsoft.com/office/drawing/2014/chartex" xmlns:cx1="http://schemas.microsoft.com/office/drawing/2015/9/8/chartex" xmlns:cx2="http://schemas.microsoft.com/office/drawing/2015/10/21/chartex" xmlns:cx3="http://schemas.microsoft.com/office/drawing/2016/5/9/chartex" xmlns:cx4="http://schemas.microsoft.com/office/drawing/2016/5/10/chartex" xmlns:cx5="http://schemas.microsoft.com/office/drawing/2016/5/11/chartex" xmlns:cx6="http://schemas.microsoft.com/office/drawing/2016/5/12/chartex" xmlns:cx7="http://schemas.microsoft.com/office/drawing/2016/5/13/chartex" xmlns:cx8="http://schemas.microsoft.com/office/drawing/2016/5/14/chartex" xmlns:mc="http://schemas.openxmlformats.org/markup-compatibility/2006" xmlns:aink="http://schemas.microsoft.com/office/drawing/2016/ink" xmlns:am3d="http://schemas.microsoft.com/office/drawing/2017/model3d" xmlns:o="urn:schemas-microsoft-com:office:office" xmlns:oel="http://schemas.microsoft.com/office/2019/extlst" xmlns:r="http://schemas.openxmlformats.org/officeDocument/2006/relationships" xmlns:m="http://schemas.openxmlformats.org/officeDocument/2006/math" xmlns:v="urn:schemas-microsoft-com:vml" xmlns:wp14="http://schemas.microsoft.com/office/word/2010/wordprocessingDrawing" xmlns:wp="http://schemas.openxmlformats.org/drawingml/2006/wordprocessingDrawing" xmlns:w10="urn:schemas-microsoft-com:office:word" xmlns:w="http://schemas.openxmlformats.org/wordprocessingml/2006/main" xmlns:w14="http://schemas.microsoft.com/office/word/2010/wordml" xmlns:w15="http://schemas.microsoft.com/office/word/2012/wordml" xmlns:w16cex="http://schemas.microsoft.com/office/word/2018/wordml/cex" xmlns:w16cid="http://schemas.microsoft.com/office/word/2016/wordml/cid" xmlns:w16="http://schemas.microsoft.com/office/word/2018/wordml" xmlns:w16du="http://schemas.microsoft.com/office/word/2023/wordml/word16du" xmlns:w16sdtdh="http://schemas.microsoft.com/office/word/2020/wordml/sdtdatahash" xmlns:w16sdtfl="http://schemas.microsoft.com/office/word/2024/wordml/sdtformatlock" xmlns:w16se="http://schemas.microsoft.com/office/word/2015/wordml/symex" xmlns:wpg="http://schemas.microsoft.com/office/word/2010/wordprocessingGroup" xmlns:wpi="http://schemas.microsoft.com/office/word/2010/wordprocessingInk" xmlns:wne="http://schemas.microsoft.com/office/word/2006/wordml" xmlns:wps="http://schemas.microsoft.com/office/word/2010/wordprocessingShape" mc:Ignorable="w14 w15 w16se w16cid w16 w16cex w16sdtdh w16sdtfl w16du wp14">
+  <w:p>
+    <w:pPr>
+      <w:pStyle w:val="Footer"/>
+    </w:pPr>
+  </w:p>
+</w:ftr>
+</file>
+
+<file path=word/footer2.xml><?xml version="1.0" encoding="utf-8"?>
 <w:ftr xmlns:wpc="http://schemas.microsoft.com/office/word/2010/wordprocessingCanvas" xmlns:cx="http://schemas.microsoft.com/office/drawing/2014/chartex" xmlns:cx1="http://schemas.microsoft.com/office/drawing/2015/9/8/chartex" xmlns:cx2="http://schemas.microsoft.com/office/drawing/2015/10/21/chartex" xmlns:cx3="http://schemas.microsoft.com/office/drawing/2016/5/9/chartex" xmlns:cx4="http://schemas.microsoft.com/office/drawing/2016/5/10/chartex" xmlns:cx5="http://schemas.microsoft.com/office/drawing/2016/5/11/chartex" xmlns:cx6="http://schemas.microsoft.com/office/drawing/2016/5/12/chartex" xmlns:cx7="http://schemas.microsoft.com/office/drawing/2016/5/13/chartex" xmlns:cx8="http://schemas.microsoft.com/office/drawing/2016/5/14/chartex" xmlns:mc="http://schemas.openxmlformats.org/markup-compatibility/2006" xmlns:aink="http://schemas.microsoft.com/office/drawing/2016/ink" xmlns:am3d="http://schemas.microsoft.com/office/drawing/2017/model3d" xmlns:o="urn:schemas-microsoft-com:office:office" xmlns:oel="http://schemas.microsoft.com/office/2019/extlst" xmlns:r="http://schemas.openxmlformats.org/officeDocument/2006/relationships" xmlns:m="http://schemas.openxmlformats.org/officeDocument/2006/math" xmlns:v="urn:schemas-microsoft-com:vml" xmlns:wp14="http://schemas.microsoft.com/office/word/2010/wordprocessingDrawing" xmlns:wp="http://schemas.openxmlformats.org/drawingml/2006/wordprocessingDrawing" xmlns:w10="urn:schemas-microsoft-com:office:word" xmlns:w="http://schemas.openxmlformats.org/wordprocessingml/2006/main" xmlns:w14="http://schemas.microsoft.com/office/word/2010/wordml" xmlns:w15="http://schemas.microsoft.com/office/word/2012/wordml" xmlns:w16cex="http://schemas.microsoft.com/office/word/2018/wordml/cex" xmlns:w16cid="http://schemas.microsoft.com/office/word/2016/wordml/cid" xmlns:w16="http://schemas.microsoft.com/office/word/2018/wordml" xmlns:w16du="http://schemas.microsoft.com/office/word/2023/wordml/word16du" xmlns:w16sdtdh="http://schemas.microsoft.com/office/word/2020/wordml/sdtdatahash" xmlns:w16sdtfl="http://schemas.microsoft.com/office/word/2024/wordml/sdtformatlock" xmlns:w16se="http://schemas.microsoft.com/office/word/2015/wordml/symex" xmlns:wpg="http://schemas.microsoft.com/office/word/2010/wordprocessingGroup" xmlns:wpi="http://schemas.microsoft.com/office/word/2010/wordprocessingInk" xmlns:wne="http://schemas.microsoft.com/office/word/2006/wordml" xmlns:wps="http://schemas.microsoft.com/office/word/2010/wordprocessingShape" mc:Ignorable="w14 w15 w16se w16cid w16 w16cex w16sdtdh w16sdtfl w16du wp14">
   <w:p>
     <w:pPr>
@@ -1411,6 +1515,16 @@
 </w:ftr>
 </file>
 
+<file path=word/footer3.xml><?xml version="1.0" encoding="utf-8"?>
+<w:ftr xmlns:wpc="http://schemas.microsoft.com/office/word/2010/wordprocessingCanvas" xmlns:cx="http://schemas.microsoft.com/office/drawing/2014/chartex" xmlns:cx1="http://schemas.microsoft.com/office/drawing/2015/9/8/chartex" xmlns:cx2="http://schemas.microsoft.com/office/drawing/2015/10/21/chartex" xmlns:cx3="http://schemas.microsoft.com/office/drawing/2016/5/9/chartex" xmlns:cx4="http://schemas.microsoft.com/office/drawing/2016/5/10/chartex" xmlns:cx5="http://schemas.microsoft.com/office/drawing/2016/5/11/chartex" xmlns:cx6="http://schemas.microsoft.com/office/drawing/2016/5/12/chartex" xmlns:cx7="http://schemas.microsoft.com/office/drawing/2016/5/13/chartex" xmlns:cx8="http://schemas.microsoft.com/office/drawing/2016/5/14/chartex" xmlns:mc="http://schemas.openxmlformats.org/markup-compatibility/2006" xmlns:aink="http://schemas.microsoft.com/office/drawing/2016/ink" xmlns:am3d="http://schemas.microsoft.com/office/drawing/2017/model3d" xmlns:o="urn:schemas-microsoft-com:office:office" xmlns:oel="http://schemas.microsoft.com/office/2019/extlst" xmlns:r="http://schemas.openxmlformats.org/officeDocument/2006/relationships" xmlns:m="http://schemas.openxmlformats.org/officeDocument/2006/math" xmlns:v="urn:schemas-microsoft-com:vml" xmlns:wp14="http://schemas.microsoft.com/office/word/2010/wordprocessingDrawing" xmlns:wp="http://schemas.openxmlformats.org/drawingml/2006/wordprocessingDrawing" xmlns:w10="urn:schemas-microsoft-com:office:word" xmlns:w="http://schemas.openxmlformats.org/wordprocessingml/2006/main" xmlns:w14="http://schemas.microsoft.com/office/word/2010/wordml" xmlns:w15="http://schemas.microsoft.com/office/word/2012/wordml" xmlns:w16cex="http://schemas.microsoft.com/office/word/2018/wordml/cex" xmlns:w16cid="http://schemas.microsoft.com/office/word/2016/wordml/cid" xmlns:w16="http://schemas.microsoft.com/office/word/2018/wordml" xmlns:w16du="http://schemas.microsoft.com/office/word/2023/wordml/word16du" xmlns:w16sdtdh="http://schemas.microsoft.com/office/word/2020/wordml/sdtdatahash" xmlns:w16sdtfl="http://schemas.microsoft.com/office/word/2024/wordml/sdtformatlock" xmlns:w16se="http://schemas.microsoft.com/office/word/2015/wordml/symex" xmlns:wpg="http://schemas.microsoft.com/office/word/2010/wordprocessingGroup" xmlns:wpi="http://schemas.microsoft.com/office/word/2010/wordprocessingInk" xmlns:wne="http://schemas.microsoft.com/office/word/2006/wordml" xmlns:wps="http://schemas.microsoft.com/office/word/2010/wordprocessingShape" mc:Ignorable="w14 w15 w16se w16cid w16 w16cex w16sdtdh w16sdtfl w16du wp14">
+  <w:p>
+    <w:pPr>
+      <w:pStyle w:val="Footer"/>
+    </w:pPr>
+  </w:p>
+</w:ftr>
+</file>
+
 <file path=word/footnotes.xml><?xml version="1.0" encoding="utf-8"?>
 <w:footnotes xmlns:wpc="http://schemas.microsoft.com/office/word/2010/wordprocessingCanvas" xmlns:cx="http://schemas.microsoft.com/office/drawing/2014/chartex" xmlns:cx1="http://schemas.microsoft.com/office/drawing/2015/9/8/chartex" xmlns:cx2="http://schemas.microsoft.com/office/drawing/2015/10/21/chartex" xmlns:cx3="http://schemas.microsoft.com/office/drawing/2016/5/9/chartex" xmlns:cx4="http://schemas.microsoft.com/office/drawing/2016/5/10/chartex" xmlns:cx5="http://schemas.microsoft.com/office/drawing/2016/5/11/chartex" xmlns:cx6="http://schemas.microsoft.com/office/drawing/2016/5/12/chartex" xmlns:cx7="http://schemas.microsoft.com/office/drawing/2016/5/13/chartex" xmlns:cx8="http://schemas.microsoft.com/office/drawing/2016/5/14/chartex" xmlns:mc="http://schemas.openxmlformats.org/markup-compatibility/2006" xmlns:aink="http://schemas.microsoft.com/office/drawing/2016/ink" xmlns:am3d="http://schemas.microsoft.com/office/drawing/2017/model3d" xmlns:o="urn:schemas-microsoft-com:office:office" xmlns:oel="http://schemas.microsoft.com/office/2019/extlst" xmlns:r="http://schemas.openxmlformats.org/officeDocument/2006/relationships" xmlns:m="http://schemas.openxmlformats.org/officeDocument/2006/math" xmlns:v="urn:schemas-microsoft-com:vml" xmlns:wp14="http://schemas.microsoft.com/office/word/2010/wordprocessingDrawing" xmlns:wp="http://schemas.openxmlformats.org/drawingml/2006/wordprocessingDrawing" xmlns:w10="urn:schemas-microsoft-com:office:word" xmlns:w="http://schemas.openxmlformats.org/wordprocessingml/2006/main" xmlns:w14="http://schemas.microsoft.com/office/word/2010/wordml" xmlns:w15="http://schemas.microsoft.com/office/word/2012/wordml" xmlns:w16cex="http://schemas.microsoft.com/office/word/2018/wordml/cex" xmlns:w16cid="http://schemas.microsoft.com/office/word/2016/wordml/cid" xmlns:w16="http://schemas.microsoft.com/office/word/2018/wordml" xmlns:w16du="http://schemas.microsoft.com/office/word/2023/wordml/word16du" xmlns:w16sdtdh="http://schemas.microsoft.com/office/word/2020/wordml/sdtdatahash" xmlns:w16sdtfl="http://schemas.microsoft.com/office/word/2024/wordml/sdtformatlock" xmlns:w16se="http://schemas.microsoft.com/office/word/2015/wordml/symex" xmlns:wpg="http://schemas.microsoft.com/office/word/2010/wordprocessingGroup" xmlns:wpi="http://schemas.microsoft.com/office/word/2010/wordprocessingInk" xmlns:wne="http://schemas.microsoft.com/office/word/2006/wordml" xmlns:wps="http://schemas.microsoft.com/office/word/2010/wordprocessingShape" mc:Ignorable="w14 w15 w16se w16cid w16 w16cex w16sdtdh w16sdtfl w16du wp14">
   <w:footnote w:type="separator" w:id="-1">
@@ -1438,9 +1552,20 @@
 
 <file path=word/header1.xml><?xml version="1.0" encoding="utf-8"?>
 <w:hdr xmlns:wpc="http://schemas.microsoft.com/office/word/2010/wordprocessingCanvas" xmlns:cx="http://schemas.microsoft.com/office/drawing/2014/chartex" xmlns:cx1="http://schemas.microsoft.com/office/drawing/2015/9/8/chartex" xmlns:cx2="http://schemas.microsoft.com/office/drawing/2015/10/21/chartex" xmlns:cx3="http://schemas.microsoft.com/office/drawing/2016/5/9/chartex" xmlns:cx4="http://schemas.microsoft.com/office/drawing/2016/5/10/chartex" xmlns:cx5="http://schemas.microsoft.com/office/drawing/2016/5/11/chartex" xmlns:cx6="http://schemas.microsoft.com/office/drawing/2016/5/12/chartex" xmlns:cx7="http://schemas.microsoft.com/office/drawing/2016/5/13/chartex" xmlns:cx8="http://schemas.microsoft.com/office/drawing/2016/5/14/chartex" xmlns:mc="http://schemas.openxmlformats.org/markup-compatibility/2006" xmlns:aink="http://schemas.microsoft.com/office/drawing/2016/ink" xmlns:am3d="http://schemas.microsoft.com/office/drawing/2017/model3d" xmlns:o="urn:schemas-microsoft-com:office:office" xmlns:oel="http://schemas.microsoft.com/office/2019/extlst" xmlns:r="http://schemas.openxmlformats.org/officeDocument/2006/relationships" xmlns:m="http://schemas.openxmlformats.org/officeDocument/2006/math" xmlns:v="urn:schemas-microsoft-com:vml" xmlns:wp14="http://schemas.microsoft.com/office/word/2010/wordprocessingDrawing" xmlns:wp="http://schemas.openxmlformats.org/drawingml/2006/wordprocessingDrawing" xmlns:w10="urn:schemas-microsoft-com:office:word" xmlns:w="http://schemas.openxmlformats.org/wordprocessingml/2006/main" xmlns:w14="http://schemas.microsoft.com/office/word/2010/wordml" xmlns:w15="http://schemas.microsoft.com/office/word/2012/wordml" xmlns:w16cex="http://schemas.microsoft.com/office/word/2018/wordml/cex" xmlns:w16cid="http://schemas.microsoft.com/office/word/2016/wordml/cid" xmlns:w16="http://schemas.microsoft.com/office/word/2018/wordml" xmlns:w16du="http://schemas.microsoft.com/office/word/2023/wordml/word16du" xmlns:w16sdtdh="http://schemas.microsoft.com/office/word/2020/wordml/sdtdatahash" xmlns:w16sdtfl="http://schemas.microsoft.com/office/word/2024/wordml/sdtformatlock" xmlns:w16se="http://schemas.microsoft.com/office/word/2015/wordml/symex" xmlns:wpg="http://schemas.microsoft.com/office/word/2010/wordprocessingGroup" xmlns:wpi="http://schemas.microsoft.com/office/word/2010/wordprocessingInk" xmlns:wne="http://schemas.microsoft.com/office/word/2006/wordml" xmlns:wps="http://schemas.microsoft.com/office/word/2010/wordprocessingShape" mc:Ignorable="w14 w15 w16se w16cid w16 w16cex w16sdtdh w16sdtfl w16du wp14">
+  <w:p>
+    <w:pPr>
+      <w:pStyle w:val="Header"/>
+    </w:pPr>
+  </w:p>
+</w:hdr>
+</file>
+
+<file path=word/header2.xml><?xml version="1.0" encoding="utf-8"?>
+<w:hdr xmlns:wpc="http://schemas.microsoft.com/office/word/2010/wordprocessingCanvas" xmlns:cx="http://schemas.microsoft.com/office/drawing/2014/chartex" xmlns:cx1="http://schemas.microsoft.com/office/drawing/2015/9/8/chartex" xmlns:cx2="http://schemas.microsoft.com/office/drawing/2015/10/21/chartex" xmlns:cx3="http://schemas.microsoft.com/office/drawing/2016/5/9/chartex" xmlns:cx4="http://schemas.microsoft.com/office/drawing/2016/5/10/chartex" xmlns:cx5="http://schemas.microsoft.com/office/drawing/2016/5/11/chartex" xmlns:cx6="http://schemas.microsoft.com/office/drawing/2016/5/12/chartex" xmlns:cx7="http://schemas.microsoft.com/office/drawing/2016/5/13/chartex" xmlns:cx8="http://schemas.microsoft.com/office/drawing/2016/5/14/chartex" xmlns:mc="http://schemas.openxmlformats.org/markup-compatibility/2006" xmlns:aink="http://schemas.microsoft.com/office/drawing/2016/ink" xmlns:am3d="http://schemas.microsoft.com/office/drawing/2017/model3d" xmlns:o="urn:schemas-microsoft-com:office:office" xmlns:oel="http://schemas.microsoft.com/office/2019/extlst" xmlns:r="http://schemas.openxmlformats.org/officeDocument/2006/relationships" xmlns:m="http://schemas.openxmlformats.org/officeDocument/2006/math" xmlns:v="urn:schemas-microsoft-com:vml" xmlns:wp14="http://schemas.microsoft.com/office/word/2010/wordprocessingDrawing" xmlns:wp="http://schemas.openxmlformats.org/drawingml/2006/wordprocessingDrawing" xmlns:w10="urn:schemas-microsoft-com:office:word" xmlns:w="http://schemas.openxmlformats.org/wordprocessingml/2006/main" xmlns:w14="http://schemas.microsoft.com/office/word/2010/wordml" xmlns:w15="http://schemas.microsoft.com/office/word/2012/wordml" xmlns:w16cex="http://schemas.microsoft.com/office/word/2018/wordml/cex" xmlns:w16cid="http://schemas.microsoft.com/office/word/2016/wordml/cid" xmlns:w16="http://schemas.microsoft.com/office/word/2018/wordml" xmlns:w16du="http://schemas.microsoft.com/office/word/2023/wordml/word16du" xmlns:w16sdtdh="http://schemas.microsoft.com/office/word/2020/wordml/sdtdatahash" xmlns:w16sdtfl="http://schemas.microsoft.com/office/word/2024/wordml/sdtformatlock" xmlns:w16se="http://schemas.microsoft.com/office/word/2015/wordml/symex" xmlns:wpg="http://schemas.microsoft.com/office/word/2010/wordprocessingGroup" xmlns:wpi="http://schemas.microsoft.com/office/word/2010/wordprocessingInk" xmlns:wne="http://schemas.microsoft.com/office/word/2006/wordml" xmlns:wps="http://schemas.microsoft.com/office/word/2010/wordprocessingShape" mc:Ignorable="w14 w15 w16se w16cid w16 w16cex w16sdtdh w16sdtfl w16du wp14">
   <w:tbl>
     <w:tblPr>
       <w:tblW w:w="9559" w:type="dxa"/>
+      <w:tblInd w:w="-456" w:type="dxa"/>
       <w:tblCellMar>
         <w:left w:w="0" w:type="dxa"/>
         <w:right w:w="0" w:type="dxa"/>
@@ -1969,7 +2094,7 @@
               <w:sz w:val="26"/>
               <w:szCs w:val="26"/>
             </w:rPr>
-            <w:t xml:space="preserve">      </w:t>
+            <w:t xml:space="preserve"> </w:t>
           </w:r>
           <w:r>
             <w:rPr>
@@ -1980,7 +2105,18 @@
               <w:sz w:val="26"/>
               <w:szCs w:val="26"/>
             </w:rPr>
-            <w:t xml:space="preserve">      </w:t>
+            <w:t xml:space="preserve"> </w:t>
+          </w:r>
+          <w:r>
+            <w:rPr>
+              <w:rFonts w:ascii="BC Sans" w:hAnsi="BC Sans"/>
+              <w:b/>
+              <w:bCs/>
+              <w:color w:val="000000"/>
+              <w:sz w:val="26"/>
+              <w:szCs w:val="26"/>
+            </w:rPr>
+            <w:t xml:space="preserve"> </w:t>
           </w:r>
           <w:r>
             <w:rPr>
@@ -2026,7 +2162,18 @@
               <w:sz w:val="26"/>
               <w:szCs w:val="26"/>
             </w:rPr>
-            <w:t xml:space="preserve"> #: </w:t>
+            <w:t xml:space="preserve"> #:</w:t>
+          </w:r>
+          <w:r>
+            <w:rPr>
+              <w:rFonts w:ascii="BC Sans" w:hAnsi="BC Sans"/>
+              <w:b/>
+              <w:bCs/>
+              <w:color w:val="000000"/>
+              <w:sz w:val="26"/>
+              <w:szCs w:val="26"/>
+            </w:rPr>
+            <w:t xml:space="preserve"> </w:t>
           </w:r>
           <w:r>
             <w:rPr>
@@ -2108,7 +2255,7 @@
               <w:sz w:val="26"/>
               <w:szCs w:val="26"/>
             </w:rPr>
-            <w:t xml:space="preserve">        </w:t>
+            <w:t xml:space="preserve"> </w:t>
           </w:r>
           <w:r>
             <w:rPr>
@@ -2119,7 +2266,18 @@
               <w:sz w:val="26"/>
               <w:szCs w:val="26"/>
             </w:rPr>
-            <w:t xml:space="preserve">    </w:t>
+            <w:t xml:space="preserve"> </w:t>
+          </w:r>
+          <w:r>
+            <w:rPr>
+              <w:rFonts w:ascii="BC Sans" w:hAnsi="BC Sans"/>
+              <w:b/>
+              <w:bCs/>
+              <w:color w:val="000000"/>
+              <w:sz w:val="26"/>
+              <w:szCs w:val="26"/>
+            </w:rPr>
+            <w:t xml:space="preserve"> </w:t>
           </w:r>
           <w:r>
             <w:rPr>
@@ -2247,17 +2405,6 @@
             </w:rPr>
             <w:br/>
           </w:r>
-          <w:r>
-            <w:rPr>
-              <w:rFonts w:ascii="BC Sans" w:hAnsi="BC Sans"/>
-              <w:b/>
-              <w:bCs/>
-              <w:color w:val="000000"/>
-              <w:sz w:val="26"/>
-              <w:szCs w:val="26"/>
-            </w:rPr>
-            <w:t xml:space="preserve">         </w:t>
-          </w:r>
           <w:proofErr w:type="gramStart"/>
           <w:r>
             <w:rPr>
@@ -2268,7 +2415,29 @@
               <w:sz w:val="26"/>
               <w:szCs w:val="26"/>
             </w:rPr>
-            <w:t xml:space="preserve">   </w:t>
+            <w:t xml:space="preserve"> </w:t>
+          </w:r>
+          <w:r>
+            <w:rPr>
+              <w:rFonts w:ascii="BC Sans" w:hAnsi="BC Sans"/>
+              <w:b/>
+              <w:bCs/>
+              <w:color w:val="000000"/>
+              <w:sz w:val="26"/>
+              <w:szCs w:val="26"/>
+            </w:rPr>
+            <w:t xml:space="preserve"> </w:t>
+          </w:r>
+          <w:r>
+            <w:rPr>
+              <w:rFonts w:ascii="BC Sans" w:hAnsi="BC Sans"/>
+              <w:b/>
+              <w:bCs/>
+              <w:color w:val="000000"/>
+              <w:sz w:val="26"/>
+              <w:szCs w:val="26"/>
+            </w:rPr>
+            <w:t xml:space="preserve"> </w:t>
           </w:r>
           <w:r>
             <w:rPr>
@@ -2740,6 +2909,61 @@
               <w:sz w:val="24"/>
               <w:szCs w:val="24"/>
             </w:rPr>
+            <w:t xml:space="preserve">   </w:t>
+          </w:r>
+          <w:r>
+            <w:rPr>
+              <w:rFonts w:ascii="BC Sans" w:hAnsi="BC Sans"/>
+              <w:b/>
+              <w:bCs/>
+              <w:color w:val="000000"/>
+              <w:sz w:val="24"/>
+              <w:szCs w:val="24"/>
+            </w:rPr>
+            <w:t xml:space="preserve"> </w:t>
+          </w:r>
+          <w:r>
+            <w:rPr>
+              <w:rFonts w:ascii="BC Sans" w:hAnsi="BC Sans"/>
+              <w:b/>
+              <w:bCs/>
+              <w:color w:val="000000"/>
+              <w:sz w:val="24"/>
+              <w:szCs w:val="24"/>
+            </w:rPr>
+            <w:t xml:space="preserve"> </w:t>
+          </w:r>
+          <w:r>
+            <w:rPr>
+              <w:rFonts w:ascii="BC Sans" w:hAnsi="BC Sans"/>
+              <w:b/>
+              <w:bCs/>
+              <w:color w:val="000000"/>
+              <w:sz w:val="24"/>
+              <w:szCs w:val="24"/>
+            </w:rPr>
+            <w:t xml:space="preserve"> </w:t>
+          </w:r>
+          <w:r>
+            <w:rPr>
+              <w:rFonts w:ascii="BC Sans" w:hAnsi="BC Sans"/>
+              <w:b/>
+              <w:bCs/>
+              <w:color w:val="000000"/>
+              <w:sz w:val="24"/>
+              <w:szCs w:val="24"/>
+            </w:rPr>
+            <w:t xml:space="preserve"> </w:t>
+          </w:r>
+          <w:r>
+            <w:rPr>
+              <w:rFonts w:ascii="BC Sans" w:hAnsi="BC Sans"/>
+              <w:b/>
+              <w:bCs/>
+              <w:color w:val="000000"/>
+              <w:sz w:val="24"/>
+              <w:szCs w:val="24"/>
+            </w:rPr>
             <w:t>Facility Name:</w:t>
           </w:r>
         </w:p>
@@ -2783,6 +3007,15 @@
               <w:sz w:val="24"/>
               <w:szCs w:val="24"/>
             </w:rPr>
+            <w:t xml:space="preserve">     </w:t>
+          </w:r>
+          <w:r>
+            <w:rPr>
+              <w:rFonts w:ascii="BC Sans" w:hAnsi="BC Sans"/>
+              <w:color w:val="000000"/>
+              <w:sz w:val="24"/>
+              <w:szCs w:val="24"/>
+            </w:rPr>
             <w:t>{{</w:t>
           </w:r>
           <w:proofErr w:type="spellStart"/>
@@ -2814,6 +3047,16 @@
       </w:tc>
     </w:tr>
   </w:tbl>
+  <w:p>
+    <w:pPr>
+      <w:pStyle w:val="Header"/>
+    </w:pPr>
+  </w:p>
+</w:hdr>
+</file>
+
+<file path=word/header3.xml><?xml version="1.0" encoding="utf-8"?>
+<w:hdr xmlns:wpc="http://schemas.microsoft.com/office/word/2010/wordprocessingCanvas" xmlns:cx="http://schemas.microsoft.com/office/drawing/2014/chartex" xmlns:cx1="http://schemas.microsoft.com/office/drawing/2015/9/8/chartex" xmlns:cx2="http://schemas.microsoft.com/office/drawing/2015/10/21/chartex" xmlns:cx3="http://schemas.microsoft.com/office/drawing/2016/5/9/chartex" xmlns:cx4="http://schemas.microsoft.com/office/drawing/2016/5/10/chartex" xmlns:cx5="http://schemas.microsoft.com/office/drawing/2016/5/11/chartex" xmlns:cx6="http://schemas.microsoft.com/office/drawing/2016/5/12/chartex" xmlns:cx7="http://schemas.microsoft.com/office/drawing/2016/5/13/chartex" xmlns:cx8="http://schemas.microsoft.com/office/drawing/2016/5/14/chartex" xmlns:mc="http://schemas.openxmlformats.org/markup-compatibility/2006" xmlns:aink="http://schemas.microsoft.com/office/drawing/2016/ink" xmlns:am3d="http://schemas.microsoft.com/office/drawing/2017/model3d" xmlns:o="urn:schemas-microsoft-com:office:office" xmlns:oel="http://schemas.microsoft.com/office/2019/extlst" xmlns:r="http://schemas.openxmlformats.org/officeDocument/2006/relationships" xmlns:m="http://schemas.openxmlformats.org/officeDocument/2006/math" xmlns:v="urn:schemas-microsoft-com:vml" xmlns:wp14="http://schemas.microsoft.com/office/word/2010/wordprocessingDrawing" xmlns:wp="http://schemas.openxmlformats.org/drawingml/2006/wordprocessingDrawing" xmlns:w10="urn:schemas-microsoft-com:office:word" xmlns:w="http://schemas.openxmlformats.org/wordprocessingml/2006/main" xmlns:w14="http://schemas.microsoft.com/office/word/2010/wordml" xmlns:w15="http://schemas.microsoft.com/office/word/2012/wordml" xmlns:w16cex="http://schemas.microsoft.com/office/word/2018/wordml/cex" xmlns:w16cid="http://schemas.microsoft.com/office/word/2016/wordml/cid" xmlns:w16="http://schemas.microsoft.com/office/word/2018/wordml" xmlns:w16du="http://schemas.microsoft.com/office/word/2023/wordml/word16du" xmlns:w16sdtdh="http://schemas.microsoft.com/office/word/2020/wordml/sdtdatahash" xmlns:w16sdtfl="http://schemas.microsoft.com/office/word/2024/wordml/sdtformatlock" xmlns:w16se="http://schemas.microsoft.com/office/word/2015/wordml/symex" xmlns:wpg="http://schemas.microsoft.com/office/word/2010/wordprocessingGroup" xmlns:wpi="http://schemas.microsoft.com/office/word/2010/wordprocessingInk" xmlns:wne="http://schemas.microsoft.com/office/word/2006/wordml" xmlns:wps="http://schemas.microsoft.com/office/word/2010/wordprocessingShape" mc:Ignorable="w14 w15 w16se w16cid w16 w16cex w16sdtdh w16sdtfl w16du wp14">
   <w:p>
     <w:pPr>
       <w:pStyle w:val="Header"/>
@@ -4159,7 +4402,6 @@
   <w:style w:type="character" w:default="1" w:styleId="DefaultParagraphFont">
     <w:name w:val="Default Paragraph Font"/>
     <w:uiPriority w:val="1"/>
-    <w:semiHidden/>
     <w:unhideWhenUsed/>
   </w:style>
   <w:style w:type="table" w:default="1" w:styleId="TableNormal">
@@ -15309,19 +15551,6 @@
 </file>
 
 <file path=customXml/item1.xml><?xml version="1.0" encoding="utf-8"?>
-<b:Sources xmlns:b="http://schemas.openxmlformats.org/officeDocument/2006/bibliography" xmlns="http://schemas.openxmlformats.org/officeDocument/2006/bibliography" SelectedStyle="/APA.XSL" StyleName="APA"/>
-</file>
-
-<file path=customXml/item2.xml><?xml version="1.0" encoding="utf-8"?>
-<?mso-contentType ?>
-<FormTemplates xmlns="http://schemas.microsoft.com/sharepoint/v3/contenttype/forms">
-  <Display>DocumentLibraryForm</Display>
-  <Edit>DocumentLibraryForm</Edit>
-  <New>DocumentLibraryForm</New>
-</FormTemplates>
-</file>
-
-<file path=customXml/item3.xml><?xml version="1.0" encoding="utf-8"?>
 <ct:contentTypeSchema xmlns:ct="http://schemas.microsoft.com/office/2006/metadata/contentType" xmlns:ma="http://schemas.microsoft.com/office/2006/metadata/properties/metaAttributes" ct:_="" ma:_="" ma:contentTypeName="Document" ma:contentTypeID="0x01010015F16144C0593A4A82C8AE0B67DB460F" ma:contentTypeVersion="11" ma:contentTypeDescription="Create a new document." ma:contentTypeScope="" ma:versionID="f03428ffc1746d68619392bc270e65d0">
   <xsd:schema xmlns:xsd="http://www.w3.org/2001/XMLSchema" xmlns:xs="http://www.w3.org/2001/XMLSchema" xmlns:p="http://schemas.microsoft.com/office/2006/metadata/properties" xmlns:ns2="94d5cf59-5162-48bc-aa9b-620df72947f5" xmlns:ns3="8350b7c0-334b-4e19-bfc1-744f6a979eee" targetNamespace="http://schemas.microsoft.com/office/2006/metadata/properties" ma:root="true" ma:fieldsID="2206ae29c74f0be434f81d51f34f460d" ns2:_="" ns3:_="">
     <xsd:import namespace="94d5cf59-5162-48bc-aa9b-620df72947f5"/>
@@ -15516,7 +15745,7 @@
 </ct:contentTypeSchema>
 </file>
 
-<file path=customXml/item4.xml><?xml version="1.0" encoding="utf-8"?>
+<file path=customXml/item2.xml><?xml version="1.0" encoding="utf-8"?>
 <p:properties xmlns:p="http://schemas.microsoft.com/office/2006/metadata/properties" xmlns:xsi="http://www.w3.org/2001/XMLSchema-instance" xmlns:pc="http://schemas.microsoft.com/office/infopath/2007/PartnerControls">
   <documentManagement>
     <lcf76f155ced4ddcb4097134ff3c332f xmlns="94d5cf59-5162-48bc-aa9b-620df72947f5">
@@ -15527,23 +15756,20 @@
 </p:properties>
 </file>
 
-<file path=customXml/itemProps1.xml><?xml version="1.0" encoding="utf-8"?>
-<ds:datastoreItem xmlns:ds="http://schemas.openxmlformats.org/officeDocument/2006/customXml" ds:itemID="{EF278816-EC6F-A645-907D-7F25AECB1D4A}">
-  <ds:schemaRefs>
-    <ds:schemaRef ds:uri="http://schemas.openxmlformats.org/officeDocument/2006/bibliography"/>
-  </ds:schemaRefs>
-</ds:datastoreItem>
+<file path=customXml/item3.xml><?xml version="1.0" encoding="utf-8"?>
+<b:Sources xmlns:b="http://schemas.openxmlformats.org/officeDocument/2006/bibliography" xmlns="http://schemas.openxmlformats.org/officeDocument/2006/bibliography" SelectedStyle="/APA.XSL" StyleName="APA"/>
 </file>
 
-<file path=customXml/itemProps2.xml><?xml version="1.0" encoding="utf-8"?>
-<ds:datastoreItem xmlns:ds="http://schemas.openxmlformats.org/officeDocument/2006/customXml" ds:itemID="{91A8AB22-D8CB-4C35-BBCC-40F5043EBB53}">
-  <ds:schemaRefs>
-    <ds:schemaRef ds:uri="http://schemas.microsoft.com/sharepoint/v3/contenttype/forms"/>
-  </ds:schemaRefs>
-</ds:datastoreItem>
+<file path=customXml/item4.xml><?xml version="1.0" encoding="utf-8"?>
+<?mso-contentType ?>
+<FormTemplates xmlns="http://schemas.microsoft.com/sharepoint/v3/contenttype/forms">
+  <Display>DocumentLibraryForm</Display>
+  <Edit>DocumentLibraryForm</Edit>
+  <New>DocumentLibraryForm</New>
+</FormTemplates>
 </file>
 
-<file path=customXml/itemProps3.xml><?xml version="1.0" encoding="utf-8"?>
+<file path=customXml/itemProps1.xml><?xml version="1.0" encoding="utf-8"?>
 <ds:datastoreItem xmlns:ds="http://schemas.openxmlformats.org/officeDocument/2006/customXml" ds:itemID="{716A724E-36BE-4088-9F4F-670D68551C4A}">
   <ds:schemaRefs>
     <ds:schemaRef ds:uri="http://schemas.microsoft.com/office/2006/metadata/contentType"/>
@@ -15562,7 +15788,7 @@
 </ds:datastoreItem>
 </file>
 
-<file path=customXml/itemProps4.xml><?xml version="1.0" encoding="utf-8"?>
+<file path=customXml/itemProps2.xml><?xml version="1.0" encoding="utf-8"?>
 <ds:datastoreItem xmlns:ds="http://schemas.openxmlformats.org/officeDocument/2006/customXml" ds:itemID="{61ED79F1-5630-4B1C-A47C-F6A42359E588}">
   <ds:schemaRefs>
     <ds:schemaRef ds:uri="http://schemas.microsoft.com/office/2006/metadata/properties"/>
@@ -15573,6 +15799,22 @@
 </ds:datastoreItem>
 </file>
 
+<file path=customXml/itemProps3.xml><?xml version="1.0" encoding="utf-8"?>
+<ds:datastoreItem xmlns:ds="http://schemas.openxmlformats.org/officeDocument/2006/customXml" ds:itemID="{EF278816-EC6F-A645-907D-7F25AECB1D4A}">
+  <ds:schemaRefs>
+    <ds:schemaRef ds:uri="http://schemas.openxmlformats.org/officeDocument/2006/bibliography"/>
+  </ds:schemaRefs>
+</ds:datastoreItem>
+</file>
+
+<file path=customXml/itemProps4.xml><?xml version="1.0" encoding="utf-8"?>
+<ds:datastoreItem xmlns:ds="http://schemas.openxmlformats.org/officeDocument/2006/customXml" ds:itemID="{91A8AB22-D8CB-4C35-BBCC-40F5043EBB53}">
+  <ds:schemaRefs>
+    <ds:schemaRef ds:uri="http://schemas.microsoft.com/sharepoint/v3/contenttype/forms"/>
+  </ds:schemaRefs>
+</ds:datastoreItem>
+</file>
+
 <file path=docMetadata/LabelInfo.xml><?xml version="1.0" encoding="utf-8"?>
 <clbl:labelList xmlns:clbl="http://schemas.microsoft.com/office/2020/mipLabelMetadata">
   <clbl:label id="{ccb6fc37-a1d1-4252-981c-63836d1ca50c}" enabled="1" method="Standard" siteId="{e0793d39-0939-496d-b129-198edd916feb}" removed="0"/>

</xml_diff>